<commit_message>
Restore Word download with updated PDF matching resume
</commit_message>
<xml_diff>
--- a/assets/documents/ritsuko-yoshida-resume.docx
+++ b/assets/documents/ritsuko-yoshida-resume.docx
@@ -31,7 +31,7 @@
         </w:rPr>
         <w:t xml:space="preserve">ritsukoyoshida77@gmail.com | </w:t>
       </w:r>
-      <w:hyperlink w:history="1" r:id="rIdh13zytasgqeentiyi8waj">
+      <w:hyperlink w:history="1" r:id="rId1kds6mzq2vml1c-j63yja">
         <w:r>
           <w:rPr>
             <w:rStyle w:val="Hyperlink"/>
@@ -50,7 +50,7 @@
         </w:rPr>
         <w:t xml:space="preserve"> | </w:t>
       </w:r>
-      <w:hyperlink w:history="1" r:id="rIddspktx51cntfx6win49n2">
+      <w:hyperlink w:history="1" r:id="rId_lvzkcjlmhjit-9u2kbmk">
         <w:r>
           <w:rPr>
             <w:rStyle w:val="Hyperlink"/>
@@ -265,7 +265,7 @@
           <w:sz w:val="20"/>
           <w:szCs w:val="20"/>
         </w:rPr>
-        <w:t xml:space="preserve">Relevant coursework: Managerial Accounting, Financial Reporting, Corporate Finance, Business Intelligence and Insights</w:t>
+        <w:t xml:space="preserve">Relevant coursework: Data Science &amp; Analytics, Business Intelligence and Insights, Managerial Accounting, Financial Reporting</w:t>
       </w:r>
     </w:p>
     <w:p>
@@ -283,7 +283,7 @@
           <w:sz w:val="24"/>
           <w:szCs w:val="24"/>
         </w:rPr>
-        <w:t xml:space="preserve">FINANCE AND ANALYTICS PROJECTS</w:t>
+        <w:t xml:space="preserve">ANALYTICS AND FINANCE PROJECTS</w:t>
       </w:r>
     </w:p>
     <w:p>
@@ -293,7 +293,7 @@
         </w:tabs>
         <w:spacing w:after="0" w:before="20"/>
       </w:pPr>
-      <w:hyperlink w:history="1" r:id="rIdlk9kftpu3xxw9rqsa66sg">
+      <w:hyperlink w:history="1" r:id="rId3wuighdkbsxa9aaanbmiv">
         <w:r>
           <w:rPr>
             <w:rStyle w:val="Hyperlink"/>
@@ -426,19 +426,19 @@
           <w:sz w:val="20"/>
           <w:szCs w:val="20"/>
         </w:rPr>
-        <w:t xml:space="preserve">Open Avenues Foundation, Build Fellowship</w:t>
-      </w:r>
-      <w:r>
-        <w:rPr>
-          <w:rFonts w:ascii="Times New Roman" w:cs="Times New Roman" w:eastAsia="Times New Roman" w:hAnsi="Times New Roman"/>
-          <w:b/>
-          <w:bCs/>
-          <w:i/>
-          <w:iCs/>
-          <w:sz w:val="20"/>
-          <w:szCs w:val="20"/>
-        </w:rPr>
-        <w:t xml:space="preserve">	Remote</w:t>
+        <w:t xml:space="preserve">Hult International Business School</w:t>
+      </w:r>
+      <w:r>
+        <w:rPr>
+          <w:rFonts w:ascii="Times New Roman" w:cs="Times New Roman" w:eastAsia="Times New Roman" w:hAnsi="Times New Roman"/>
+          <w:b/>
+          <w:bCs/>
+          <w:i/>
+          <w:iCs/>
+          <w:sz w:val="20"/>
+          <w:szCs w:val="20"/>
+        </w:rPr>
+        <w:t xml:space="preserve">	Cambridge, MA</w:t>
       </w:r>
     </w:p>
     <w:p>
@@ -456,53 +456,53 @@
           <w:sz w:val="20"/>
           <w:szCs w:val="20"/>
         </w:rPr>
-        <w:t xml:space="preserve">Business case for Posture Mate, a posture support product concept</w:t>
-      </w:r>
-      <w:r>
-        <w:rPr>
-          <w:rFonts w:ascii="Times New Roman" w:cs="Times New Roman" w:eastAsia="Times New Roman" w:hAnsi="Times New Roman"/>
-          <w:i/>
-          <w:iCs/>
-          <w:sz w:val="20"/>
-          <w:szCs w:val="20"/>
-        </w:rPr>
-        <w:t xml:space="preserve">	Jul 2026 – Sep 2026</w:t>
-      </w:r>
-    </w:p>
-    <w:p>
-      <w:pPr>
-        <w:pStyle w:val="ListParagraph"/>
-        <w:numPr>
-          <w:ilvl w:val="0"/>
-          <w:numId w:val="2"/>
-        </w:numPr>
-        <w:spacing w:after="0"/>
-      </w:pPr>
-      <w:r>
-        <w:rPr>
-          <w:rFonts w:ascii="Times New Roman" w:cs="Times New Roman" w:eastAsia="Times New Roman" w:hAnsi="Times New Roman"/>
-          <w:sz w:val="20"/>
-          <w:szCs w:val="20"/>
-        </w:rPr>
-        <w:t xml:space="preserve">Built the business case independently, covering market research, competitor analysis, and positioning</w:t>
-      </w:r>
-    </w:p>
-    <w:p>
-      <w:pPr>
-        <w:pStyle w:val="ListParagraph"/>
-        <w:numPr>
-          <w:ilvl w:val="0"/>
-          <w:numId w:val="2"/>
-        </w:numPr>
-        <w:spacing w:after="0"/>
-      </w:pPr>
-      <w:r>
-        <w:rPr>
-          <w:rFonts w:ascii="Times New Roman" w:cs="Times New Roman" w:eastAsia="Times New Roman" w:hAnsi="Times New Roman"/>
-          <w:sz w:val="20"/>
-          <w:szCs w:val="20"/>
-        </w:rPr>
-        <w:t xml:space="preserve">Set pricing and cost assumptions across manufacturing, logistics, and distribution to test unit economics and a 3 year financial outlook</w:t>
+        <w:t xml:space="preserve">Hospital Performance Analytics, Business Intelligence and Insights</w:t>
+      </w:r>
+      <w:r>
+        <w:rPr>
+          <w:rFonts w:ascii="Times New Roman" w:cs="Times New Roman" w:eastAsia="Times New Roman" w:hAnsi="Times New Roman"/>
+          <w:i/>
+          <w:iCs/>
+          <w:sz w:val="20"/>
+          <w:szCs w:val="20"/>
+        </w:rPr>
+        <w:t xml:space="preserve">	Nov 2024 – Dec 2024</w:t>
+      </w:r>
+    </w:p>
+    <w:p>
+      <w:pPr>
+        <w:pStyle w:val="ListParagraph"/>
+        <w:numPr>
+          <w:ilvl w:val="0"/>
+          <w:numId w:val="2"/>
+        </w:numPr>
+        <w:spacing w:after="0"/>
+      </w:pPr>
+      <w:r>
+        <w:rPr>
+          <w:rFonts w:ascii="Times New Roman" w:cs="Times New Roman" w:eastAsia="Times New Roman" w:hAnsi="Times New Roman"/>
+          <w:sz w:val="20"/>
+          <w:szCs w:val="20"/>
+        </w:rPr>
+        <w:t xml:space="preserve">Applied PCA to 100,000+ healthcare records, separating financial and operational factors from patient experience factors</w:t>
+      </w:r>
+    </w:p>
+    <w:p>
+      <w:pPr>
+        <w:pStyle w:val="ListParagraph"/>
+        <w:numPr>
+          <w:ilvl w:val="0"/>
+          <w:numId w:val="2"/>
+        </w:numPr>
+        <w:spacing w:after="0"/>
+      </w:pPr>
+      <w:r>
+        <w:rPr>
+          <w:rFonts w:ascii="Times New Roman" w:cs="Times New Roman" w:eastAsia="Times New Roman" w:hAnsi="Times New Roman"/>
+          <w:sz w:val="20"/>
+          <w:szCs w:val="20"/>
+        </w:rPr>
+        <w:t xml:space="preserve">Found that larger, higher revenue hospitals did not consistently earn better patient experience ratings</w:t>
       </w:r>
     </w:p>
     <w:p>
@@ -520,19 +520,19 @@
           <w:sz w:val="20"/>
           <w:szCs w:val="20"/>
         </w:rPr>
-        <w:t xml:space="preserve">Hult International Business School</w:t>
-      </w:r>
-      <w:r>
-        <w:rPr>
-          <w:rFonts w:ascii="Times New Roman" w:cs="Times New Roman" w:eastAsia="Times New Roman" w:hAnsi="Times New Roman"/>
-          <w:b/>
-          <w:bCs/>
-          <w:i/>
-          <w:iCs/>
-          <w:sz w:val="20"/>
-          <w:szCs w:val="20"/>
-        </w:rPr>
-        <w:t xml:space="preserve">	Cambridge, MA</w:t>
+        <w:t xml:space="preserve">Open Avenues Foundation, Build Fellowship</w:t>
+      </w:r>
+      <w:r>
+        <w:rPr>
+          <w:rFonts w:ascii="Times New Roman" w:cs="Times New Roman" w:eastAsia="Times New Roman" w:hAnsi="Times New Roman"/>
+          <w:b/>
+          <w:bCs/>
+          <w:i/>
+          <w:iCs/>
+          <w:sz w:val="20"/>
+          <w:szCs w:val="20"/>
+        </w:rPr>
+        <w:t xml:space="preserve">	Remote</w:t>
       </w:r>
     </w:p>
     <w:p>
@@ -550,53 +550,53 @@
           <w:sz w:val="20"/>
           <w:szCs w:val="20"/>
         </w:rPr>
-        <w:t xml:space="preserve">Hospital Performance Analytics, Business Intelligence and Insights</w:t>
-      </w:r>
-      <w:r>
-        <w:rPr>
-          <w:rFonts w:ascii="Times New Roman" w:cs="Times New Roman" w:eastAsia="Times New Roman" w:hAnsi="Times New Roman"/>
-          <w:i/>
-          <w:iCs/>
-          <w:sz w:val="20"/>
-          <w:szCs w:val="20"/>
-        </w:rPr>
-        <w:t xml:space="preserve">	Nov 2024 – Dec 2024</w:t>
-      </w:r>
-    </w:p>
-    <w:p>
-      <w:pPr>
-        <w:pStyle w:val="ListParagraph"/>
-        <w:numPr>
-          <w:ilvl w:val="0"/>
-          <w:numId w:val="2"/>
-        </w:numPr>
-        <w:spacing w:after="0"/>
-      </w:pPr>
-      <w:r>
-        <w:rPr>
-          <w:rFonts w:ascii="Times New Roman" w:cs="Times New Roman" w:eastAsia="Times New Roman" w:hAnsi="Times New Roman"/>
-          <w:sz w:val="20"/>
-          <w:szCs w:val="20"/>
-        </w:rPr>
-        <w:t xml:space="preserve">Applied PCA to 100,000+ healthcare records, separating financial and operational factors from patient experience factors</w:t>
-      </w:r>
-    </w:p>
-    <w:p>
-      <w:pPr>
-        <w:pStyle w:val="ListParagraph"/>
-        <w:numPr>
-          <w:ilvl w:val="0"/>
-          <w:numId w:val="2"/>
-        </w:numPr>
-        <w:spacing w:after="0"/>
-      </w:pPr>
-      <w:r>
-        <w:rPr>
-          <w:rFonts w:ascii="Times New Roman" w:cs="Times New Roman" w:eastAsia="Times New Roman" w:hAnsi="Times New Roman"/>
-          <w:sz w:val="20"/>
-          <w:szCs w:val="20"/>
-        </w:rPr>
-        <w:t xml:space="preserve">Found that larger, higher revenue hospitals did not consistently earn better patient experience ratings</w:t>
+        <w:t xml:space="preserve">Business case for Posture Mate, a posture support product concept</w:t>
+      </w:r>
+      <w:r>
+        <w:rPr>
+          <w:rFonts w:ascii="Times New Roman" w:cs="Times New Roman" w:eastAsia="Times New Roman" w:hAnsi="Times New Roman"/>
+          <w:i/>
+          <w:iCs/>
+          <w:sz w:val="20"/>
+          <w:szCs w:val="20"/>
+        </w:rPr>
+        <w:t xml:space="preserve">	Jul 2026 – Sep 2026</w:t>
+      </w:r>
+    </w:p>
+    <w:p>
+      <w:pPr>
+        <w:pStyle w:val="ListParagraph"/>
+        <w:numPr>
+          <w:ilvl w:val="0"/>
+          <w:numId w:val="2"/>
+        </w:numPr>
+        <w:spacing w:after="0"/>
+      </w:pPr>
+      <w:r>
+        <w:rPr>
+          <w:rFonts w:ascii="Times New Roman" w:cs="Times New Roman" w:eastAsia="Times New Roman" w:hAnsi="Times New Roman"/>
+          <w:sz w:val="20"/>
+          <w:szCs w:val="20"/>
+        </w:rPr>
+        <w:t xml:space="preserve">Built the business case independently, covering market research, competitor analysis, and positioning</w:t>
+      </w:r>
+    </w:p>
+    <w:p>
+      <w:pPr>
+        <w:pStyle w:val="ListParagraph"/>
+        <w:numPr>
+          <w:ilvl w:val="0"/>
+          <w:numId w:val="2"/>
+        </w:numPr>
+        <w:spacing w:after="0"/>
+      </w:pPr>
+      <w:r>
+        <w:rPr>
+          <w:rFonts w:ascii="Times New Roman" w:cs="Times New Roman" w:eastAsia="Times New Roman" w:hAnsi="Times New Roman"/>
+          <w:sz w:val="20"/>
+          <w:szCs w:val="20"/>
+        </w:rPr>
+        <w:t xml:space="preserve">Set pricing and cost assumptions across manufacturing, logistics, and distribution to test unit economics and a 3 year financial outlook</w:t>
       </w:r>
     </w:p>
     <w:p>
@@ -1039,6 +1039,29 @@
           <w:sz w:val="20"/>
           <w:szCs w:val="20"/>
         </w:rPr>
+        <w:t xml:space="preserve">Analytics: </w:t>
+      </w:r>
+      <w:r>
+        <w:rPr>
+          <w:rFonts w:ascii="Times New Roman" w:cs="Times New Roman" w:eastAsia="Times New Roman" w:hAnsi="Times New Roman"/>
+          <w:sz w:val="20"/>
+          <w:szCs w:val="20"/>
+        </w:rPr>
+        <w:t xml:space="preserve">Time series forecasting (Holt-Winters, ETS), regression, Principal Component Analysis, forecast error testing (MAPE)</w:t>
+      </w:r>
+    </w:p>
+    <w:p>
+      <w:pPr>
+        <w:spacing w:after="0"/>
+      </w:pPr>
+      <w:r>
+        <w:rPr>
+          <w:rFonts w:ascii="Times New Roman" w:cs="Times New Roman" w:eastAsia="Times New Roman" w:hAnsi="Times New Roman"/>
+          <w:b/>
+          <w:bCs/>
+          <w:sz w:val="20"/>
+          <w:szCs w:val="20"/>
+        </w:rPr>
         <w:t xml:space="preserve">Finance: </w:t>
       </w:r>
       <w:r>
@@ -1048,29 +1071,6 @@
           <w:szCs w:val="20"/>
         </w:rPr>
         <w:t xml:space="preserve">Three statement forecasting, ratio and DuPont analysis, unit economics, financial statement analysis from SEC filings</w:t>
-      </w:r>
-    </w:p>
-    <w:p>
-      <w:pPr>
-        <w:spacing w:after="0"/>
-      </w:pPr>
-      <w:r>
-        <w:rPr>
-          <w:rFonts w:ascii="Times New Roman" w:cs="Times New Roman" w:eastAsia="Times New Roman" w:hAnsi="Times New Roman"/>
-          <w:b/>
-          <w:bCs/>
-          <w:sz w:val="20"/>
-          <w:szCs w:val="20"/>
-        </w:rPr>
-        <w:t xml:space="preserve">Analytics: </w:t>
-      </w:r>
-      <w:r>
-        <w:rPr>
-          <w:rFonts w:ascii="Times New Roman" w:cs="Times New Roman" w:eastAsia="Times New Roman" w:hAnsi="Times New Roman"/>
-          <w:sz w:val="20"/>
-          <w:szCs w:val="20"/>
-        </w:rPr>
-        <w:t xml:space="preserve">Time series forecasting (Holt-Winters, ETS), regression, Principal Component Analysis, forecast error testing (MAPE)</w:t>
       </w:r>
     </w:p>
     <w:p>

</xml_diff>

<commit_message>
Align portfolio claims and resume downloads with final supplied details
</commit_message>
<xml_diff>
--- a/assets/documents/ritsuko-yoshida-resume.docx
+++ b/assets/documents/ritsuko-yoshida-resume.docx
@@ -31,7 +31,7 @@
         </w:rPr>
         <w:t xml:space="preserve">ritsukoyoshida77@gmail.com | </w:t>
       </w:r>
-      <w:hyperlink w:history="1" r:id="rId1kds6mzq2vml1c-j63yja">
+      <w:hyperlink w:history="1" r:id="rIdxlka-pktgte6ww2rblbjf">
         <w:r>
           <w:rPr>
             <w:rStyle w:val="Hyperlink"/>
@@ -50,7 +50,7 @@
         </w:rPr>
         <w:t xml:space="preserve"> | </w:t>
       </w:r>
-      <w:hyperlink w:history="1" r:id="rId_lvzkcjlmhjit-9u2kbmk">
+      <w:hyperlink w:history="1" r:id="rId7zek6rfx0s5gokoad-a2r">
         <w:r>
           <w:rPr>
             <w:rStyle w:val="Hyperlink"/>
@@ -293,7 +293,7 @@
         </w:tabs>
         <w:spacing w:after="0" w:before="20"/>
       </w:pPr>
-      <w:hyperlink w:history="1" r:id="rId3wuighdkbsxa9aaanbmiv">
+      <w:hyperlink w:history="1" r:id="rIdw-vnuppobi89e744wryjl">
         <w:r>
           <w:rPr>
             <w:rStyle w:val="Hyperlink"/>
@@ -362,7 +362,7 @@
           <w:sz w:val="20"/>
           <w:szCs w:val="20"/>
         </w:rPr>
-        <w:t xml:space="preserve">Built a 4 quarter forecast of PayPal's income statement, balance sheet, and cash flow from SEC filings, with ratio and DuPont analysis</w:t>
+        <w:t xml:space="preserve">Built a 4 quarter forecast of PayPal's income statement, balance sheet, and cash flow from SEC filings and PitchBook data, with ratio and DuPont analysis</w:t>
       </w:r>
     </w:p>
     <w:p>

</xml_diff>